<commit_message>
Updates for architecture diagram
</commit_message>
<xml_diff>
--- a/Documentation_for_TravelMemory_App.docx
+++ b/Documentation_for_TravelMemory_App.docx
@@ -29,6 +29,8 @@
           <w:rFonts w:ascii="Times New Roman" w:hAnsi="Times New Roman" w:cs="Times New Roman"/>
           <w:b/>
           <w:bCs/>
+          <w:sz w:val="32"/>
+          <w:szCs w:val="32"/>
         </w:rPr>
       </w:pPr>
     </w:p>
@@ -38,6 +40,8 @@
           <w:rFonts w:ascii="Times New Roman" w:hAnsi="Times New Roman" w:cs="Times New Roman"/>
           <w:b/>
           <w:bCs/>
+          <w:sz w:val="32"/>
+          <w:szCs w:val="32"/>
         </w:rPr>
       </w:pPr>
       <w:r>
@@ -45,8 +49,34 @@
           <w:rFonts w:ascii="Times New Roman" w:hAnsi="Times New Roman" w:cs="Times New Roman"/>
           <w:b/>
           <w:bCs/>
-        </w:rPr>
-        <w:t>Set up the backend running on Node.js</w:t>
+          <w:sz w:val="32"/>
+          <w:szCs w:val="32"/>
+        </w:rPr>
+        <w:t xml:space="preserve">GIT Repo: </w:t>
+      </w:r>
+      <w:r>
+        <w:rPr>
+          <w:rFonts w:ascii="Times New Roman" w:hAnsi="Times New Roman" w:cs="Times New Roman"/>
+          <w:sz w:val="32"/>
+          <w:szCs w:val="32"/>
+        </w:rPr>
+        <w:t>https://</w:t>
+      </w:r>
+      <w:r>
+        <w:rPr>
+          <w:rFonts w:ascii="Times New Roman" w:hAnsi="Times New Roman" w:cs="Times New Roman"/>
+          <w:sz w:val="32"/>
+          <w:szCs w:val="32"/>
+        </w:rPr>
+        <w:t>github.com/ApoorvaD90/TravelMemory</w:t>
+      </w:r>
+      <w:r>
+        <w:rPr>
+          <w:rFonts w:ascii="Times New Roman" w:hAnsi="Times New Roman" w:cs="Times New Roman"/>
+          <w:sz w:val="32"/>
+          <w:szCs w:val="32"/>
+        </w:rPr>
+        <w:t>Application</w:t>
       </w:r>
     </w:p>
     <w:p>
@@ -57,6 +87,23 @@
           <w:bCs/>
         </w:rPr>
       </w:pPr>
+    </w:p>
+    <w:p>
+      <w:pPr>
+        <w:rPr>
+          <w:rFonts w:ascii="Times New Roman" w:hAnsi="Times New Roman" w:cs="Times New Roman"/>
+          <w:b/>
+          <w:bCs/>
+        </w:rPr>
+      </w:pPr>
+      <w:r>
+        <w:rPr>
+          <w:rFonts w:ascii="Times New Roman" w:hAnsi="Times New Roman" w:cs="Times New Roman"/>
+          <w:b/>
+          <w:bCs/>
+        </w:rPr>
+        <w:t>Set up the backend running on Node.js</w:t>
+      </w:r>
     </w:p>
     <w:p>
       <w:pPr>
@@ -108,6 +155,7 @@
       <w:r>
         <w:rPr>
           <w:rFonts w:ascii="Times New Roman" w:hAnsi="Times New Roman" w:cs="Times New Roman"/>
+          <w:noProof/>
           <w:sz w:val="20"/>
           <w:szCs w:val="20"/>
         </w:rPr>
@@ -300,6 +348,7 @@
       <w:r>
         <w:rPr>
           <w:rFonts w:ascii="Times New Roman" w:hAnsi="Times New Roman" w:cs="Times New Roman"/>
+          <w:noProof/>
           <w:sz w:val="20"/>
           <w:szCs w:val="20"/>
         </w:rPr>
@@ -391,6 +440,7 @@
       <w:r>
         <w:rPr>
           <w:rFonts w:ascii="Times New Roman" w:hAnsi="Times New Roman" w:cs="Times New Roman"/>
+          <w:noProof/>
           <w:sz w:val="20"/>
           <w:szCs w:val="20"/>
         </w:rPr>
@@ -531,6 +581,7 @@
       <w:r>
         <w:rPr>
           <w:rFonts w:ascii="Times New Roman" w:hAnsi="Times New Roman" w:cs="Times New Roman"/>
+          <w:noProof/>
           <w:sz w:val="20"/>
           <w:szCs w:val="20"/>
         </w:rPr>
@@ -630,6 +681,7 @@
       <w:r>
         <w:rPr>
           <w:rFonts w:ascii="Times New Roman" w:hAnsi="Times New Roman" w:cs="Times New Roman"/>
+          <w:noProof/>
           <w:sz w:val="20"/>
           <w:szCs w:val="20"/>
         </w:rPr>
@@ -690,6 +742,7 @@
       <w:r>
         <w:rPr>
           <w:rFonts w:ascii="Times New Roman" w:hAnsi="Times New Roman" w:cs="Times New Roman"/>
+          <w:noProof/>
           <w:sz w:val="20"/>
           <w:szCs w:val="20"/>
         </w:rPr>
@@ -809,6 +862,7 @@
       <w:r>
         <w:rPr>
           <w:rFonts w:ascii="Times New Roman" w:hAnsi="Times New Roman" w:cs="Times New Roman"/>
+          <w:noProof/>
           <w:sz w:val="20"/>
           <w:szCs w:val="20"/>
         </w:rPr>
@@ -998,6 +1052,7 @@
           <w:rFonts w:ascii="Times New Roman" w:hAnsi="Times New Roman" w:cs="Times New Roman"/>
           <w:b/>
           <w:bCs/>
+          <w:noProof/>
         </w:rPr>
         <w:drawing>
           <wp:inline distT="0" distB="0" distL="0" distR="0" wp14:anchorId="1996EBDD" wp14:editId="40295E0D">
@@ -1071,6 +1126,7 @@
           <w:rFonts w:ascii="Times New Roman" w:hAnsi="Times New Roman" w:cs="Times New Roman"/>
           <w:b/>
           <w:bCs/>
+          <w:noProof/>
         </w:rPr>
         <w:drawing>
           <wp:inline distT="0" distB="0" distL="0" distR="0" wp14:anchorId="08A9AEAE" wp14:editId="37ABF0B2">
@@ -1169,6 +1225,7 @@
           <w:rFonts w:ascii="Times New Roman" w:hAnsi="Times New Roman" w:cs="Times New Roman"/>
           <w:b/>
           <w:bCs/>
+          <w:noProof/>
         </w:rPr>
         <w:drawing>
           <wp:inline distT="0" distB="0" distL="0" distR="0" wp14:anchorId="103DA374" wp14:editId="27B4401B">
@@ -1242,6 +1299,7 @@
           <w:rFonts w:ascii="Times New Roman" w:hAnsi="Times New Roman" w:cs="Times New Roman"/>
           <w:b/>
           <w:bCs/>
+          <w:noProof/>
         </w:rPr>
         <w:drawing>
           <wp:inline distT="0" distB="0" distL="0" distR="0" wp14:anchorId="62001963" wp14:editId="38DAD849">
@@ -1302,6 +1360,7 @@
           <w:rFonts w:ascii="Times New Roman" w:hAnsi="Times New Roman" w:cs="Times New Roman"/>
           <w:b/>
           <w:bCs/>
+          <w:noProof/>
         </w:rPr>
         <w:drawing>
           <wp:inline distT="0" distB="0" distL="0" distR="0" wp14:anchorId="0957CBC3" wp14:editId="32D1FBA9">
@@ -1909,6 +1968,7 @@
       <w:r>
         <w:rPr>
           <w:rFonts w:ascii="Times New Roman" w:hAnsi="Times New Roman" w:cs="Times New Roman"/>
+          <w:noProof/>
           <w:sz w:val="20"/>
           <w:szCs w:val="20"/>
         </w:rPr>
@@ -1969,6 +2029,7 @@
       <w:r>
         <w:rPr>
           <w:rFonts w:ascii="Times New Roman" w:hAnsi="Times New Roman" w:cs="Times New Roman"/>
+          <w:noProof/>
           <w:sz w:val="20"/>
           <w:szCs w:val="20"/>
         </w:rPr>
@@ -2068,6 +2129,7 @@
       <w:r>
         <w:rPr>
           <w:rFonts w:ascii="Times New Roman" w:hAnsi="Times New Roman" w:cs="Times New Roman"/>
+          <w:noProof/>
           <w:sz w:val="20"/>
           <w:szCs w:val="20"/>
         </w:rPr>
@@ -2152,6 +2214,7 @@
       <w:r>
         <w:rPr>
           <w:rFonts w:ascii="Times New Roman" w:hAnsi="Times New Roman" w:cs="Times New Roman"/>
+          <w:noProof/>
           <w:sz w:val="20"/>
           <w:szCs w:val="20"/>
         </w:rPr>
@@ -2283,6 +2346,7 @@
       <w:r>
         <w:rPr>
           <w:rFonts w:ascii="Times New Roman" w:hAnsi="Times New Roman" w:cs="Times New Roman"/>
+          <w:noProof/>
           <w:sz w:val="20"/>
           <w:szCs w:val="20"/>
         </w:rPr>
@@ -2361,6 +2425,7 @@
       <w:r>
         <w:rPr>
           <w:rFonts w:ascii="Times New Roman" w:hAnsi="Times New Roman" w:cs="Times New Roman"/>
+          <w:noProof/>
           <w:sz w:val="20"/>
           <w:szCs w:val="20"/>
         </w:rPr>
@@ -2466,6 +2531,7 @@
       <w:r>
         <w:rPr>
           <w:rFonts w:ascii="Times New Roman" w:hAnsi="Times New Roman" w:cs="Times New Roman"/>
+          <w:noProof/>
           <w:sz w:val="20"/>
           <w:szCs w:val="20"/>
         </w:rPr>
@@ -4208,6 +4274,29 @@
       <w:spacing w:val="5"/>
     </w:rPr>
   </w:style>
+  <w:style w:type="character" w:styleId="Hyperlink">
+    <w:name w:val="Hyperlink"/>
+    <w:basedOn w:val="DefaultParagraphFont"/>
+    <w:uiPriority w:val="99"/>
+    <w:unhideWhenUsed/>
+    <w:rsid w:val="007344BE"/>
+    <w:rPr>
+      <w:color w:val="467886" w:themeColor="hyperlink"/>
+      <w:u w:val="single"/>
+    </w:rPr>
+  </w:style>
+  <w:style w:type="character" w:styleId="UnresolvedMention">
+    <w:name w:val="Unresolved Mention"/>
+    <w:basedOn w:val="DefaultParagraphFont"/>
+    <w:uiPriority w:val="99"/>
+    <w:semiHidden/>
+    <w:unhideWhenUsed/>
+    <w:rsid w:val="007344BE"/>
+    <w:rPr>
+      <w:color w:val="605E5C"/>
+      <w:shd w:val="clear" w:color="auto" w:fill="E1DFDD"/>
+    </w:rPr>
+  </w:style>
 </w:styles>
 </file>
 

</xml_diff>